<commit_message>
Plain pension hint; no "Show 9+ cards" link on the top-3 screens
The pension card's hint now reads "Local tax-advantaged pension plans" (no
VGBL, SIPP or pillar 3a); 2.2a says its cards are the products in the Critical
pile; the preview's "Show 9+ cards" link is gone. The Word documents and the
database seed are rebuilt from the updated script.

Co-Authored-By: Claude Opus 5.5 (1M context) <noreply@anthropic.com>
</commit_message>
<xml_diff>
--- a/questionnaire/v3/Ceres questionnaire - third draft.docx
+++ b/questionnaire/v3/Ceres questionnaire - third draft.docx
@@ -2399,7 +2399,7 @@
           <w:color w:val="8C857A"/>
           <w:sz w:val="18"/>
         </w:rPr>
-        <w:t xml:space="preserve">  Any pension plan, including VGBL, SIPP and pillar 3a</w:t>
+        <w:t xml:space="preserve">  Local tax-advantaged pension plans</w:t>
       </w:r>
     </w:p>
     <w:p>
@@ -2525,7 +2525,7 @@
           <w:color w:val="1F4B3A"/>
           <w:sz w:val="21"/>
         </w:rPr>
-        <w:t>From your Critical pile.</w:t>
+        <w:t>These are the products in your Critical pile.</w:t>
       </w:r>
     </w:p>
     <w:p>
@@ -5062,7 +5062,7 @@
           <w:color w:val="8C857A"/>
           <w:sz w:val="18"/>
         </w:rPr>
-        <w:t xml:space="preserve">  Any pension plan, including VGBL, SIPP and pillar 3a</w:t>
+        <w:t xml:space="preserve">  Local tax-advantaged pension plans</w:t>
       </w:r>
     </w:p>
     <w:p>
@@ -5246,7 +5246,7 @@
           <w:color w:val="8C857A"/>
           <w:sz w:val="18"/>
         </w:rPr>
-        <w:t xml:space="preserve">  Any pension plan, including VGBL, SIPP and pillar 3a</w:t>
+        <w:t xml:space="preserve">  Local tax-advantaged pension plans</w:t>
       </w:r>
     </w:p>
     <w:p>

</xml_diff>